<commit_message>
added Design and documentation
</commit_message>
<xml_diff>
--- a/Research/AI-Implementation/Annotation.docx
+++ b/Research/AI-Implementation/Annotation.docx
@@ -2,6 +2,47 @@
 <file path=word/document.xml><?xml version="1.0" encoding="utf-8"?>
 <w:document xmlns:wpc="http://schemas.microsoft.com/office/word/2010/wordprocessingCanvas" xmlns:cx="http://schemas.microsoft.com/office/drawing/2014/chartex" xmlns:cx1="http://schemas.microsoft.com/office/drawing/2015/9/8/chartex" xmlns:cx2="http://schemas.microsoft.com/office/drawing/2015/10/21/chartex" xmlns:cx3="http://schemas.microsoft.com/office/drawing/2016/5/9/chartex" xmlns:cx4="http://schemas.microsoft.com/office/drawing/2016/5/10/chartex" xmlns:cx5="http://schemas.microsoft.com/office/drawing/2016/5/11/chartex" xmlns:cx6="http://schemas.microsoft.com/office/drawing/2016/5/12/chartex" xmlns:cx7="http://schemas.microsoft.com/office/drawing/2016/5/13/chartex" xmlns:cx8="http://schemas.microsoft.com/office/drawing/2016/5/14/chartex" xmlns:mc="http://schemas.openxmlformats.org/markup-compatibility/2006" xmlns:aink="http://schemas.microsoft.com/office/drawing/2016/ink" xmlns:am3d="http://schemas.microsoft.com/office/drawing/2017/model3d" xmlns:o="urn:schemas-microsoft-com:office:office" xmlns:r="http://schemas.openxmlformats.org/officeDocument/2006/relationships" xmlns:m="http://schemas.openxmlformats.org/officeDocument/2006/math" xmlns:v="urn:schemas-microsoft-com:vml" xmlns:wp14="http://schemas.microsoft.com/office/word/2010/wordprocessingDrawing" xmlns:wp="http://schemas.openxmlformats.org/drawingml/2006/wordprocessingDrawing" xmlns:w10="urn:schemas-microsoft-com:office:word" xmlns:w="http://schemas.openxmlformats.org/wordprocessingml/2006/main" xmlns:w14="http://schemas.microsoft.com/office/word/2010/wordml" xmlns:w15="http://schemas.microsoft.com/office/word/2012/wordml" xmlns:w16cex="http://schemas.microsoft.com/office/word/2018/wordml/cex" xmlns:w16cid="http://schemas.microsoft.com/office/word/2016/wordml/cid" xmlns:w16="http://schemas.microsoft.com/office/word/2018/wordml" xmlns:w16se="http://schemas.microsoft.com/office/word/2015/wordml/symex" xmlns:wpg="http://schemas.microsoft.com/office/word/2010/wordprocessingGroup" xmlns:wpi="http://schemas.microsoft.com/office/word/2010/wordprocessingInk" xmlns:wne="http://schemas.microsoft.com/office/word/2006/wordml" xmlns:wps="http://schemas.microsoft.com/office/word/2010/wordprocessingShape" mc:Ignorable="w14 w15 w16se w16cid w16 w16cex wp14">
   <w:body>
+    <w:p>
+      <w:pPr>
+        <w:shd w:val="clear" w:color="auto" w:fill="FFFFFF"/>
+        <w:spacing w:line="360" w:lineRule="atLeast"/>
+        <w:rPr>
+          <w:rFonts w:ascii="Google Sans" w:eastAsia="Times New Roman" w:hAnsi="Google Sans" w:cs="Times New Roman"/>
+          <w:color w:val="0A0A0A"/>
+          <w:lang w:eastAsia="en-GB"/>
+        </w:rPr>
+      </w:pPr>
+      <w:r>
+        <w:rPr>
+          <w:rFonts w:ascii="Google Sans" w:eastAsia="Times New Roman" w:hAnsi="Google Sans" w:cs="Times New Roman"/>
+          <w:color w:val="0A0A0A"/>
+          <w:lang w:eastAsia="en-GB"/>
+        </w:rPr>
+        <w:t>https://www.researchgate.net/publication/394541003_Enhancing_Construction_Site_Safety_and_Efficiency_with_YOLO_v8-_Based_Computer_Vision_Model</w:t>
+      </w:r>
+    </w:p>
+    <w:p>
+      <w:pPr>
+        <w:shd w:val="clear" w:color="auto" w:fill="FFFFFF"/>
+        <w:spacing w:line="360" w:lineRule="atLeast"/>
+        <w:rPr>
+          <w:rFonts w:ascii="Google Sans" w:eastAsia="Times New Roman" w:hAnsi="Google Sans" w:cs="Times New Roman"/>
+          <w:color w:val="0A0A0A"/>
+          <w:lang w:eastAsia="en-GB"/>
+        </w:rPr>
+      </w:pPr>
+    </w:p>
+    <w:p>
+      <w:pPr>
+        <w:shd w:val="clear" w:color="auto" w:fill="FFFFFF"/>
+        <w:spacing w:line="360" w:lineRule="atLeast"/>
+        <w:rPr>
+          <w:rFonts w:ascii="Google Sans" w:eastAsia="Times New Roman" w:hAnsi="Google Sans" w:cs="Times New Roman"/>
+          <w:color w:val="0A0A0A"/>
+          <w:lang w:eastAsia="en-GB"/>
+        </w:rPr>
+      </w:pPr>
+    </w:p>
     <w:p>
       <w:pPr>
         <w:shd w:val="clear" w:color="auto" w:fill="FFFFFF"/>
@@ -530,6 +571,7 @@
           <w:szCs w:val="30"/>
           <w:lang w:eastAsia="en-GB"/>
         </w:rPr>
+        <w:lastRenderedPageBreak/>
         <w:t>3. Implement an Automated Workflow </w:t>
       </w:r>
     </w:p>
@@ -607,7 +649,6 @@
           <w:color w:val="0A0A0A"/>
           <w:lang w:eastAsia="en-GB"/>
         </w:rPr>
-        <w:lastRenderedPageBreak/>
         <w:t>Interpolation &amp; Tracking:</w:t>
       </w:r>
       <w:r>
@@ -1128,6 +1169,7 @@
           <w:szCs w:val="30"/>
           <w:lang w:eastAsia="en-GB"/>
         </w:rPr>
+        <w:lastRenderedPageBreak/>
         <w:t>1. Open-Source Construction Datasets</w:t>
       </w:r>
     </w:p>
@@ -1181,16 +1223,7 @@
           <w:color w:val="0A0A0A"/>
           <w:lang w:eastAsia="en-GB"/>
         </w:rPr>
-        <w:t xml:space="preserve">: One of the most comprehensive datasets, featuring over 41,000 images from 174 sites. It includes 13 categories </w:t>
-      </w:r>
-      <w:r>
-        <w:rPr>
-          <w:rFonts w:ascii="Google Sans" w:eastAsia="Times New Roman" w:hAnsi="Google Sans" w:cs="Times New Roman"/>
-          <w:color w:val="0A0A0A"/>
-          <w:lang w:eastAsia="en-GB"/>
-        </w:rPr>
-        <w:lastRenderedPageBreak/>
-        <w:t>such as </w:t>
+        <w:t>: One of the most comprehensive datasets, featuring over 41,000 images from 174 sites. It includes 13 categories such as </w:t>
       </w:r>
       <w:r>
         <w:rPr>
@@ -2179,6 +2212,7 @@
           <w:color w:val="0A0A0A"/>
           <w:lang w:eastAsia="en-GB"/>
         </w:rPr>
+        <w:lastRenderedPageBreak/>
         <w:t>Recommended Model &amp; Platform:</w:t>
       </w:r>
     </w:p>
@@ -2256,7 +2290,6 @@
           <w:color w:val="0A0A0A"/>
           <w:lang w:eastAsia="en-GB"/>
         </w:rPr>
-        <w:lastRenderedPageBreak/>
         <w:t>Platform:</w:t>
       </w:r>
       <w:r>

</xml_diff>